<commit_message>
docs: entregavel oficial Fase 3 - Analise, Arquitetura e Projeto (FATEC Campinas, ADS) em .docx
</commit_message>
<xml_diff>
--- a/Fase_1_Processo_e_Planejamento_NutriPlan_v2.docx
+++ b/Fase_1_Processo_e_Planejamento_NutriPlan_v2.docx
@@ -16,7 +16,8 @@
           <w:sz w:val="24"/>
           <w:szCs w:val="24"/>
         </w:rPr>
-        <w:t xml:space="preserve">INSTITUIÇÃO DE ENSINO SUPERIOR — CURSO DE ENGENHARIA DE SOFTWARE</w:t>
+        <w:t xml:space="preserve">CENTRO ESTADUAL DE EDUCAÇÃO TECNOLÓGICA PAULA SOUZA
+FATEC CAMPINAS — FACULDADE DE TECNOLOGIA DE CAMPINAS</w:t>
       </w:r>
     </w:p>
     <w:p>
@@ -31,7 +32,8 @@
           <w:sz w:val="20"/>
           <w:szCs w:val="20"/>
         </w:rPr>
-        <w:t xml:space="preserve">DEPARTAMENTO DE COMPUTAÇÃO / DISCIPLINA DE ENGENHARIA DE SOFTWARE I</w:t>
+        <w:t xml:space="preserve">CURSO SUPERIOR DE TECNOLOGIA EM ANÁLISE E DESENVOLVIMENTO DE SISTEMAS
+DISCIPLINA: LABORATÓRIO DE ENGENHARIA DE SOFTWARE</w:t>
       </w:r>
     </w:p>
     <w:p>
@@ -82,7 +84,7 @@
           <w:sz w:val="22"/>
           <w:szCs w:val="22"/>
         </w:rPr>
-        <w:t xml:space="preserve">ENTREGÁVEL 1: PROCESSO E PLANEJAMENTO DE SOFTWARE</w:t>
+        <w:t xml:space="preserve">ENTREGÁVEL 1: PROCESSO E PLANEJAMENTO DE SOFTWARE (PROJETO EM 5 FASES)</w:t>
       </w:r>
     </w:p>
     <w:p>
@@ -99,7 +101,9 @@
           <w:sz w:val="22"/>
           <w:szCs w:val="22"/>
         </w:rPr>
-        <w:t xml:space="preserve">Autor: Gustavo Meneses Ruegenberg Rodrigues</w:t>
+        <w:t xml:space="preserve">Integrantes do Grupo:
+Gustavo Meneses Ruegenberg Rodrigues
+Fabiana Tiemi Watanabe</w:t>
       </w:r>
     </w:p>
     <w:p>
@@ -114,7 +118,7 @@
           <w:sz w:val="20"/>
           <w:szCs w:val="20"/>
         </w:rPr>
-        <w:t xml:space="preserve">Disciplina: Engenharia de Software I</w:t>
+        <w:t xml:space="preserve">Disciplina: Laboratório de Engenharia de Software</w:t>
       </w:r>
     </w:p>
     <w:p>
@@ -129,7 +133,7 @@
           <w:sz w:val="20"/>
           <w:szCs w:val="20"/>
         </w:rPr>
-        <w:t xml:space="preserve">Grau Acadêmico: Bacharelado em Engenharia de Software</w:t>
+        <w:t xml:space="preserve">Curso: Tecnologia em Análise e Desenvolvimento de Sistemas (ADS)</w:t>
       </w:r>
     </w:p>
     <w:p>
@@ -146,7 +150,7 @@
           <w:sz w:val="20"/>
           <w:szCs w:val="20"/>
         </w:rPr>
-        <w:t xml:space="preserve">SÃO PAULO — SP
+        <w:t xml:space="preserve">CAMPINAS — SP
 OUTUBRO DE 2026</w:t>
       </w:r>
     </w:p>
@@ -12893,7 +12897,7 @@
         <w:sz w:val="16"/>
         <w:szCs w:val="16"/>
       </w:rPr>
-      <w:t xml:space="preserve">Engenharia de Software I — Página </w:t>
+      <w:t xml:space="preserve">Laboratório de Engenharia de Software — ADS — Página </w:t>
     </w:r>
     <w:r>
       <w:rPr>
@@ -12985,7 +12989,7 @@
         <w:sz w:val="16"/>
         <w:szCs w:val="16"/>
       </w:rPr>
-      <w:t xml:space="preserve">NUTRIPLAN V2 — FASE 1: PROCESSO E PLANEJAMENTO DE SOFTWARE</w:t>
+      <w:t xml:space="preserve">NUTRIPLAN V2 — FASE 1: PROCESSO E PLANEJAMENTO | FATEC CAMPINAS</w:t>
     </w:r>
   </w:p>
 </w:hdr>

</xml_diff>